<commit_message>
change in some forecastmodel
</commit_message>
<xml_diff>
--- a/lakehuron.docx
+++ b/lakehuron.docx
@@ -6,47 +6,26 @@
       <w:pPr>
         <w:pStyle w:val="Title"/>
       </w:pPr>
+      <w:r>
+        <w:t>LAKEHURON.R</w:t>
+      </w:r>
+    </w:p>
+    <w:p>
+      <w:pPr>
+        <w:pStyle w:val="Date"/>
+      </w:pPr>
+      <w:r>
+        <w:t>ANKIT GHOSH</w:t>
+      </w:r>
       <w:bookmarkStart w:id="0" w:name="_GoBack"/>
-      <w:r>
-        <w:t>lakehuron.R</w:t>
-      </w:r>
-    </w:p>
-    <w:bookmarkEnd w:id="0"/>
-    <w:p>
-      <w:pPr>
-        <w:pStyle w:val="Author"/>
-        <w:jc w:val="left"/>
-      </w:pPr>
-      <w:r>
-        <w:rPr>
-          <w:b/>
-        </w:rPr>
-        <w:t>AUTHOR</w:t>
-      </w:r>
-      <w:proofErr w:type="gramStart"/>
-      <w:r>
-        <w:rPr>
-          <w:b/>
-        </w:rPr>
-        <w:t>:-</w:t>
-      </w:r>
-      <w:proofErr w:type="gramEnd"/>
-      <w:r>
-        <w:rPr>
-          <w:b/>
-        </w:rPr>
-        <w:t xml:space="preserve"> ANKIT GHOSH</w:t>
-      </w:r>
-      <w:r>
-        <w:t>:</w:t>
-      </w:r>
+      <w:bookmarkEnd w:id="0"/>
     </w:p>
     <w:p>
       <w:pPr>
         <w:pStyle w:val="Date"/>
       </w:pPr>
       <w:r>
-        <w:t>2026-01-22</w:t>
+        <w:t>2026-08-27</w:t>
       </w:r>
     </w:p>
     <w:p>
@@ -258,6 +237,34 @@
           <w:rStyle w:val="VerbatimChar"/>
         </w:rPr>
         <w:t>## [1] 98  1</w:t>
+      </w:r>
+    </w:p>
+    <w:p>
+      <w:pPr>
+        <w:pStyle w:val="SourceCode"/>
+      </w:pPr>
+      <w:r>
+        <w:rPr>
+          <w:rStyle w:val="FunctionTok"/>
+        </w:rPr>
+        <w:t>length</w:t>
+      </w:r>
+      <w:r>
+        <w:rPr>
+          <w:rStyle w:val="NormalTok"/>
+        </w:rPr>
+        <w:t>(LakeHuron)</w:t>
+      </w:r>
+    </w:p>
+    <w:p>
+      <w:pPr>
+        <w:pStyle w:val="SourceCode"/>
+      </w:pPr>
+      <w:r>
+        <w:rPr>
+          <w:rStyle w:val="VerbatimChar"/>
+        </w:rPr>
+        <w:t>## [1] 98</w:t>
       </w:r>
     </w:p>
     <w:p>
@@ -375,7 +382,7 @@
               <a:graphicData uri="http://schemas.openxmlformats.org/drawingml/2006/picture">
                 <pic:pic xmlns:pic="http://schemas.openxmlformats.org/drawingml/2006/picture">
                   <pic:nvPicPr>
-                    <pic:cNvPr id="22" name="Picture" descr="lakehuron_files/figure-docx/unnamed-chunk-1-1.png"/>
+                    <pic:cNvPr id="22" name="Picture" descr="LAKEHURON_files/figure-docx/unnamed-chunk-1-1.png"/>
                     <pic:cNvPicPr>
                       <a:picLocks noChangeAspect="1" noChangeArrowheads="1"/>
                     </pic:cNvPicPr>
@@ -434,6 +441,75 @@
         <w:rPr>
           <w:rStyle w:val="NormalTok"/>
         </w:rPr>
+        <w:t>(LakeHu</w:t>
+      </w:r>
+      <w:r>
+        <w:rPr>
+          <w:rStyle w:val="NormalTok"/>
+        </w:rPr>
+        <w:t>ron,</w:t>
+      </w:r>
+      <w:r>
+        <w:rPr>
+          <w:rStyle w:val="AttributeTok"/>
+        </w:rPr>
+        <w:t>start=</w:t>
+      </w:r>
+      <w:r>
+        <w:rPr>
+          <w:rStyle w:val="DecValTok"/>
+        </w:rPr>
+        <w:t>1875</w:t>
+      </w:r>
+      <w:r>
+        <w:rPr>
+          <w:rStyle w:val="NormalTok"/>
+        </w:rPr>
+        <w:t>,</w:t>
+      </w:r>
+      <w:r>
+        <w:rPr>
+          <w:rStyle w:val="AttributeTok"/>
+        </w:rPr>
+        <w:t>end=</w:t>
+      </w:r>
+      <w:r>
+        <w:rPr>
+          <w:rStyle w:val="DecValTok"/>
+        </w:rPr>
+        <w:t>1950</w:t>
+      </w:r>
+      <w:r>
+        <w:rPr>
+          <w:rStyle w:val="NormalTok"/>
+        </w:rPr>
+        <w:t>)</w:t>
+      </w:r>
+      <w:r>
+        <w:br/>
+      </w:r>
+      <w:r>
+        <w:rPr>
+          <w:rStyle w:val="NormalTok"/>
+        </w:rPr>
+        <w:t>lake_test</w:t>
+      </w:r>
+      <w:r>
+        <w:rPr>
+          <w:rStyle w:val="OtherTok"/>
+        </w:rPr>
+        <w:t>=</w:t>
+      </w:r>
+      <w:r>
+        <w:rPr>
+          <w:rStyle w:val="FunctionTok"/>
+        </w:rPr>
+        <w:t>window</w:t>
+      </w:r>
+      <w:r>
+        <w:rPr>
+          <w:rStyle w:val="NormalTok"/>
+        </w:rPr>
         <w:t>(LakeHuron,</w:t>
       </w:r>
       <w:r>
@@ -446,7 +522,7 @@
         <w:rPr>
           <w:rStyle w:val="DecValTok"/>
         </w:rPr>
-        <w:t>1875</w:t>
+        <w:t>1951</w:t>
       </w:r>
       <w:r>
         <w:rPr>
@@ -464,7 +540,7 @@
         <w:rPr>
           <w:rStyle w:val="DecValTok"/>
         </w:rPr>
-        <w:t>1950</w:t>
+        <w:t>1972</w:t>
       </w:r>
       <w:r>
         <w:rPr>
@@ -476,16 +552,40 @@
         <w:br/>
       </w:r>
       <w:r>
-        <w:rPr>
-          <w:rStyle w:val="NormalTok"/>
-        </w:rPr>
-        <w:t>lak</w:t>
-      </w:r>
-      <w:r>
-        <w:rPr>
-          <w:rStyle w:val="NormalTok"/>
-        </w:rPr>
-        <w:t>e_test</w:t>
+        <w:br/>
+      </w:r>
+      <w:r>
+        <w:rPr>
+          <w:rStyle w:val="CommentTok"/>
+        </w:rPr>
+        <w:t># stationary checking</w:t>
+      </w:r>
+      <w:r>
+        <w:br/>
+      </w:r>
+      <w:r>
+        <w:br/>
+      </w:r>
+      <w:r>
+        <w:rPr>
+          <w:rStyle w:val="FunctionTok"/>
+        </w:rPr>
+        <w:t>library</w:t>
+      </w:r>
+      <w:r>
+        <w:rPr>
+          <w:rStyle w:val="NormalTok"/>
+        </w:rPr>
+        <w:t>(tseries)</w:t>
+      </w:r>
+      <w:r>
+        <w:br/>
+      </w:r>
+      <w:r>
+        <w:rPr>
+          <w:rStyle w:val="NormalTok"/>
+        </w:rPr>
+        <w:t>adf_test</w:t>
       </w:r>
       <w:r>
         <w:rPr>
@@ -497,99 +597,6 @@
         <w:rPr>
           <w:rStyle w:val="FunctionTok"/>
         </w:rPr>
-        <w:t>window</w:t>
-      </w:r>
-      <w:r>
-        <w:rPr>
-          <w:rStyle w:val="NormalTok"/>
-        </w:rPr>
-        <w:t>(LakeHuron,</w:t>
-      </w:r>
-      <w:r>
-        <w:rPr>
-          <w:rStyle w:val="AttributeTok"/>
-        </w:rPr>
-        <w:t>start=</w:t>
-      </w:r>
-      <w:r>
-        <w:rPr>
-          <w:rStyle w:val="DecValTok"/>
-        </w:rPr>
-        <w:t>1951</w:t>
-      </w:r>
-      <w:r>
-        <w:rPr>
-          <w:rStyle w:val="NormalTok"/>
-        </w:rPr>
-        <w:t>,</w:t>
-      </w:r>
-      <w:r>
-        <w:rPr>
-          <w:rStyle w:val="AttributeTok"/>
-        </w:rPr>
-        <w:t>end=</w:t>
-      </w:r>
-      <w:r>
-        <w:rPr>
-          <w:rStyle w:val="DecValTok"/>
-        </w:rPr>
-        <w:t>1972</w:t>
-      </w:r>
-      <w:r>
-        <w:rPr>
-          <w:rStyle w:val="NormalTok"/>
-        </w:rPr>
-        <w:t>)</w:t>
-      </w:r>
-      <w:r>
-        <w:br/>
-      </w:r>
-      <w:r>
-        <w:br/>
-      </w:r>
-      <w:r>
-        <w:rPr>
-          <w:rStyle w:val="CommentTok"/>
-        </w:rPr>
-        <w:t># stationary checking</w:t>
-      </w:r>
-      <w:r>
-        <w:br/>
-      </w:r>
-      <w:r>
-        <w:br/>
-      </w:r>
-      <w:r>
-        <w:rPr>
-          <w:rStyle w:val="FunctionTok"/>
-        </w:rPr>
-        <w:t>library</w:t>
-      </w:r>
-      <w:r>
-        <w:rPr>
-          <w:rStyle w:val="NormalTok"/>
-        </w:rPr>
-        <w:t>(tseries)</w:t>
-      </w:r>
-      <w:r>
-        <w:br/>
-      </w:r>
-      <w:r>
-        <w:rPr>
-          <w:rStyle w:val="NormalTok"/>
-        </w:rPr>
-        <w:t>adf_test</w:t>
-      </w:r>
-      <w:r>
-        <w:rPr>
-          <w:rStyle w:val="OtherTok"/>
-        </w:rPr>
-        <w:t>=</w:t>
-      </w:r>
-      <w:r>
-        <w:rPr>
-          <w:rStyle w:val="FunctionTok"/>
-        </w:rPr>
         <w:t>adf.test</w:t>
       </w:r>
       <w:r>
@@ -603,9 +610,15 @@
       </w:r>
       <w:r>
         <w:rPr>
-          <w:rStyle w:val="NormalTok"/>
-        </w:rPr>
-        <w:t>adf_test</w:t>
+          <w:rStyle w:val="FunctionTok"/>
+        </w:rPr>
+        <w:t>print</w:t>
+      </w:r>
+      <w:r>
+        <w:rPr>
+          <w:rStyle w:val="NormalTok"/>
+        </w:rPr>
+        <w:t>(adf_test)</w:t>
       </w:r>
     </w:p>
     <w:p>
@@ -791,7 +804,7 @@
               <a:graphicData uri="http://schemas.openxmlformats.org/drawingml/2006/picture">
                 <pic:pic xmlns:pic="http://schemas.openxmlformats.org/drawingml/2006/picture">
                   <pic:nvPicPr>
-                    <pic:cNvPr id="25" name="Picture" descr="lakehuron_files/figure-docx/unnamed-chunk-1-2.png"/>
+                    <pic:cNvPr id="25" name="Picture" descr="LAKEHURON_files/figure-docx/unnamed-chunk-1-2.png"/>
                     <pic:cNvPicPr>
                       <a:picLocks noChangeAspect="1" noChangeArrowheads="1"/>
                     </pic:cNvPicPr>
@@ -832,7 +845,13 @@
         <w:rPr>
           <w:rStyle w:val="CommentTok"/>
         </w:rPr>
-        <w:t xml:space="preserve">#removing trend </w:t>
+        <w:t>#removing</w:t>
+      </w:r>
+      <w:r>
+        <w:rPr>
+          <w:rStyle w:val="CommentTok"/>
+        </w:rPr>
+        <w:t xml:space="preserve"> trend </w:t>
       </w:r>
       <w:r>
         <w:br/>
@@ -870,13 +889,7 @@
         <w:rPr>
           <w:rStyle w:val="VerbatimChar"/>
         </w:rPr>
-        <w:t>## Warning in adf.</w:t>
-      </w:r>
-      <w:r>
-        <w:rPr>
-          <w:rStyle w:val="VerbatimChar"/>
-        </w:rPr>
-        <w:t>test(diff_lake): p-value smaller than printed p-value</w:t>
+        <w:t>## Warning in adf.test(diff_lake): p-value smaller than printed p-value</w:t>
       </w:r>
     </w:p>
     <w:p>
@@ -943,7 +956,13 @@
         <w:rPr>
           <w:rStyle w:val="VerbatimChar"/>
         </w:rPr>
-        <w:t>## alternative hypothesis: stationary</w:t>
+        <w:t>## alterna</w:t>
+      </w:r>
+      <w:r>
+        <w:rPr>
+          <w:rStyle w:val="VerbatimChar"/>
+        </w:rPr>
+        <w:t>tive hypothesis: stationary</w:t>
       </w:r>
     </w:p>
     <w:p>
@@ -1103,7 +1122,7 @@
               <a:graphicData uri="http://schemas.openxmlformats.org/drawingml/2006/picture">
                 <pic:pic xmlns:pic="http://schemas.openxmlformats.org/drawingml/2006/picture">
                   <pic:nvPicPr>
-                    <pic:cNvPr id="28" name="Picture" descr="lakehuron_files/figure-docx/unnamed-chunk-1-3.png"/>
+                    <pic:cNvPr id="28" name="Picture" descr="LAKEHURON_files/figure-docx/unnamed-chunk-1-3.png"/>
                     <pic:cNvPicPr>
                       <a:picLocks noChangeAspect="1" noChangeArrowheads="1"/>
                     </pic:cNvPicPr>
@@ -1216,7 +1235,7 @@
         <w:rPr>
           <w:rStyle w:val="CommentTok"/>
         </w:rPr>
-        <w:t>#arima(1,1,2)</w:t>
+        <w:t># arima(1,1,2)</w:t>
       </w:r>
       <w:r>
         <w:br/>
@@ -1225,7 +1244,10 @@
         <w:rPr>
           <w:rStyle w:val="CommentTok"/>
         </w:rPr>
-        <w:t>#library(forecast)</w:t>
+        <w:t># library(forecast)</w:t>
+      </w:r>
+      <w:r>
+        <w:br/>
       </w:r>
       <w:r>
         <w:br/>
@@ -1413,7 +1435,13 @@
         <w:rPr>
           <w:rStyle w:val="VerbatimChar"/>
         </w:rPr>
-        <w:t>## sigma^2 estimated as 0.4259:  log likelihood = -74.68,  aic = 157.36</w:t>
+        <w:t>## sigma^2 estimated as 0.42</w:t>
+      </w:r>
+      <w:r>
+        <w:rPr>
+          <w:rStyle w:val="VerbatimChar"/>
+        </w:rPr>
+        <w:t>59:  log likelihood = -74.68,  aic = 157.36</w:t>
       </w:r>
     </w:p>
     <w:p>
@@ -1424,22 +1452,216 @@
         <w:rPr>
           <w:rStyle w:val="CommentTok"/>
         </w:rPr>
-        <w:t>#arima(1,1,1</w:t>
-      </w:r>
+        <w:t>#arima(1,1,1)</w:t>
+      </w:r>
+      <w:r>
+        <w:br/>
+      </w:r>
+      <w:r>
+        <w:rPr>
+          <w:rStyle w:val="NormalTok"/>
+        </w:rPr>
+        <w:t>manual_1</w:t>
+      </w:r>
+      <w:r>
+        <w:rPr>
+          <w:rStyle w:val="OtherTok"/>
+        </w:rPr>
+        <w:t>=</w:t>
+      </w:r>
+      <w:r>
+        <w:rPr>
+          <w:rStyle w:val="FunctionTok"/>
+        </w:rPr>
+        <w:t>arima</w:t>
+      </w:r>
+      <w:r>
+        <w:rPr>
+          <w:rStyle w:val="NormalTok"/>
+        </w:rPr>
+        <w:t>(lake_train,</w:t>
+      </w:r>
+      <w:r>
+        <w:rPr>
+          <w:rStyle w:val="AttributeTok"/>
+        </w:rPr>
+        <w:t>order =</w:t>
+      </w:r>
+      <w:r>
+        <w:rPr>
+          <w:rStyle w:val="FunctionTok"/>
+        </w:rPr>
+        <w:t>c</w:t>
+      </w:r>
+      <w:r>
+        <w:rPr>
+          <w:rStyle w:val="NormalTok"/>
+        </w:rPr>
+        <w:t>(</w:t>
+      </w:r>
+      <w:r>
+        <w:rPr>
+          <w:rStyle w:val="DecValTok"/>
+        </w:rPr>
+        <w:t>1</w:t>
+      </w:r>
+      <w:r>
+        <w:rPr>
+          <w:rStyle w:val="NormalTok"/>
+        </w:rPr>
+        <w:t>,</w:t>
+      </w:r>
+      <w:r>
+        <w:rPr>
+          <w:rStyle w:val="DecValTok"/>
+        </w:rPr>
+        <w:t>1</w:t>
+      </w:r>
+      <w:r>
+        <w:rPr>
+          <w:rStyle w:val="NormalTok"/>
+        </w:rPr>
+        <w:t>,</w:t>
+      </w:r>
+      <w:r>
+        <w:rPr>
+          <w:rStyle w:val="DecValTok"/>
+        </w:rPr>
+        <w:t>1</w:t>
+      </w:r>
+      <w:r>
+        <w:rPr>
+          <w:rStyle w:val="NormalTok"/>
+        </w:rPr>
+        <w:t>))</w:t>
+      </w:r>
+      <w:r>
+        <w:br/>
+      </w:r>
+      <w:r>
+        <w:rPr>
+          <w:rStyle w:val="FunctionTok"/>
+        </w:rPr>
+        <w:t>print</w:t>
+      </w:r>
+      <w:r>
+        <w:rPr>
+          <w:rStyle w:val="NormalTok"/>
+        </w:rPr>
+        <w:t>(manual_1)</w:t>
+      </w:r>
+    </w:p>
+    <w:p>
+      <w:pPr>
+        <w:pStyle w:val="SourceCode"/>
+      </w:pPr>
+      <w:r>
+        <w:rPr>
+          <w:rStyle w:val="VerbatimChar"/>
+        </w:rPr>
+        <w:t xml:space="preserve">## </w:t>
+      </w:r>
+      <w:r>
+        <w:br/>
+      </w:r>
+      <w:r>
+        <w:rPr>
+          <w:rStyle w:val="VerbatimChar"/>
+        </w:rPr>
+        <w:t>## Call:</w:t>
+      </w:r>
+      <w:r>
+        <w:br/>
+      </w:r>
+      <w:r>
+        <w:rPr>
+          <w:rStyle w:val="VerbatimChar"/>
+        </w:rPr>
+        <w:lastRenderedPageBreak/>
+        <w:t>## arima(x = lake_train, order = c(1, 1, 1))</w:t>
+      </w:r>
+      <w:r>
+        <w:br/>
+      </w:r>
+      <w:r>
+        <w:rPr>
+          <w:rStyle w:val="VerbatimChar"/>
+        </w:rPr>
+        <w:t xml:space="preserve">## </w:t>
+      </w:r>
+      <w:r>
+        <w:br/>
+      </w:r>
+      <w:r>
+        <w:rPr>
+          <w:rStyle w:val="VerbatimChar"/>
+        </w:rPr>
+        <w:t>## Coefficients:</w:t>
+      </w:r>
+      <w:r>
+        <w:br/>
+      </w:r>
+      <w:r>
+        <w:rPr>
+          <w:rStyle w:val="VerbatimChar"/>
+        </w:rPr>
+        <w:t>##           ar1     ma1</w:t>
+      </w:r>
+      <w:r>
+        <w:br/>
+      </w:r>
+      <w:r>
+        <w:rPr>
+          <w:rStyle w:val="VerbatimChar"/>
+        </w:rPr>
+        <w:t>##       -0.3441  0.5207</w:t>
+      </w:r>
+      <w:r>
+        <w:br/>
+      </w:r>
+      <w:r>
+        <w:rPr>
+          <w:rStyle w:val="VerbatimChar"/>
+        </w:rPr>
+        <w:t>## s.e.   0.4160  0.3809</w:t>
+      </w:r>
+      <w:r>
+        <w:br/>
+      </w:r>
+      <w:r>
+        <w:rPr>
+          <w:rStyle w:val="VerbatimChar"/>
+        </w:rPr>
+        <w:t xml:space="preserve">## </w:t>
+      </w:r>
+      <w:r>
+        <w:br/>
+      </w:r>
+      <w:r>
+        <w:rPr>
+          <w:rStyle w:val="VerbatimChar"/>
+        </w:rPr>
+        <w:t>## sigma^2 estimated as 0.4761:  log likelihood = -78.62,  aic = 163.23</w:t>
+      </w:r>
+    </w:p>
+    <w:p>
+      <w:pPr>
+        <w:pStyle w:val="SourceCode"/>
+      </w:pPr>
       <w:r>
         <w:rPr>
           <w:rStyle w:val="CommentTok"/>
         </w:rPr>
-        <w:t>)</w:t>
-      </w:r>
-      <w:r>
-        <w:br/>
-      </w:r>
-      <w:r>
-        <w:rPr>
-          <w:rStyle w:val="NormalTok"/>
-        </w:rPr>
-        <w:t>manual_1</w:t>
+        <w:t>#arima(1,1,0)</w:t>
+      </w:r>
+      <w:r>
+        <w:br/>
+      </w:r>
+      <w:r>
+        <w:rPr>
+          <w:rStyle w:val="NormalTok"/>
+        </w:rPr>
+        <w:t>manual_2</w:t>
       </w:r>
       <w:r>
         <w:rPr>
@@ -1505,7 +1727,7 @@
         <w:rPr>
           <w:rStyle w:val="DecValTok"/>
         </w:rPr>
-        <w:t>1</w:t>
+        <w:t>0</w:t>
       </w:r>
       <w:r>
         <w:rPr>
@@ -1526,7 +1748,7 @@
         <w:rPr>
           <w:rStyle w:val="NormalTok"/>
         </w:rPr>
-        <w:t>(manual_1)</w:t>
+        <w:t>(manual_2)</w:t>
       </w:r>
     </w:p>
     <w:p>
@@ -1555,16 +1777,15 @@
         <w:rPr>
           <w:rStyle w:val="VerbatimChar"/>
         </w:rPr>
-        <w:t>## arima(x = lake_train, order = c(1, 1, 1))</w:t>
-      </w:r>
-      <w:r>
-        <w:br/>
-      </w:r>
-      <w:r>
-        <w:rPr>
-          <w:rStyle w:val="VerbatimChar"/>
-        </w:rPr>
-        <w:lastRenderedPageBreak/>
+        <w:t>## arima(x = lake_train, order = c(1, 1, 0))</w:t>
+      </w:r>
+      <w:r>
+        <w:br/>
+      </w:r>
+      <w:r>
+        <w:rPr>
+          <w:rStyle w:val="VerbatimChar"/>
+        </w:rPr>
         <w:t xml:space="preserve">## </w:t>
       </w:r>
       <w:r>
@@ -1583,43 +1804,49 @@
         <w:rPr>
           <w:rStyle w:val="VerbatimChar"/>
         </w:rPr>
-        <w:t>##           ar1     ma1</w:t>
-      </w:r>
-      <w:r>
-        <w:br/>
-      </w:r>
-      <w:r>
-        <w:rPr>
-          <w:rStyle w:val="VerbatimChar"/>
-        </w:rPr>
-        <w:t>##       -0.3441  0.5207</w:t>
-      </w:r>
-      <w:r>
-        <w:br/>
-      </w:r>
-      <w:r>
-        <w:rPr>
-          <w:rStyle w:val="VerbatimChar"/>
-        </w:rPr>
-        <w:t>## s.e.   0.4160  0.3809</w:t>
-      </w:r>
-      <w:r>
-        <w:br/>
-      </w:r>
-      <w:r>
-        <w:rPr>
-          <w:rStyle w:val="VerbatimChar"/>
-        </w:rPr>
         <w:t xml:space="preserve">## </w:t>
       </w:r>
       <w:r>
-        <w:br/>
-      </w:r>
-      <w:r>
-        <w:rPr>
-          <w:rStyle w:val="VerbatimChar"/>
-        </w:rPr>
-        <w:t>## sigma^2 estimated as 0.4761:  log likelihood = -78.62,  aic = 163.23</w:t>
+        <w:rPr>
+          <w:rStyle w:val="VerbatimChar"/>
+        </w:rPr>
+        <w:t xml:space="preserve">         ar1</w:t>
+      </w:r>
+      <w:r>
+        <w:br/>
+      </w:r>
+      <w:r>
+        <w:rPr>
+          <w:rStyle w:val="VerbatimChar"/>
+        </w:rPr>
+        <w:t>##       0.1105</w:t>
+      </w:r>
+      <w:r>
+        <w:br/>
+      </w:r>
+      <w:r>
+        <w:rPr>
+          <w:rStyle w:val="VerbatimChar"/>
+        </w:rPr>
+        <w:t>## s.e.  0.1175</w:t>
+      </w:r>
+      <w:r>
+        <w:br/>
+      </w:r>
+      <w:r>
+        <w:rPr>
+          <w:rStyle w:val="VerbatimChar"/>
+        </w:rPr>
+        <w:t xml:space="preserve">## </w:t>
+      </w:r>
+      <w:r>
+        <w:br/>
+      </w:r>
+      <w:r>
+        <w:rPr>
+          <w:rStyle w:val="VerbatimChar"/>
+        </w:rPr>
+        <w:t>## sigma^2 estimated as 0.4855:  log likelihood = -79.33,  aic = 162.65</w:t>
       </w:r>
     </w:p>
     <w:p>
@@ -1630,16 +1857,31 @@
         <w:rPr>
           <w:rStyle w:val="CommentTok"/>
         </w:rPr>
-        <w:t>#arima(1,1,0)</w:t>
-      </w:r>
-      <w:r>
-        <w:br/>
-      </w:r>
-      <w:r>
-        <w:rPr>
-          <w:rStyle w:val="NormalTok"/>
-        </w:rPr>
-        <w:t>manual_2</w:t>
+        <w:t>#using autoarima</w:t>
+      </w:r>
+      <w:r>
+        <w:br/>
+      </w:r>
+      <w:r>
+        <w:rPr>
+          <w:rStyle w:val="FunctionTok"/>
+        </w:rPr>
+        <w:t>library</w:t>
+      </w:r>
+      <w:r>
+        <w:rPr>
+          <w:rStyle w:val="NormalTok"/>
+        </w:rPr>
+        <w:t>(forecast)</w:t>
+      </w:r>
+      <w:r>
+        <w:br/>
+      </w:r>
+      <w:r>
+        <w:rPr>
+          <w:rStyle w:val="NormalTok"/>
+        </w:rPr>
+        <w:t>model</w:t>
       </w:r>
       <w:r>
         <w:rPr>
@@ -1651,67 +1893,13 @@
         <w:rPr>
           <w:rStyle w:val="FunctionTok"/>
         </w:rPr>
-        <w:t>arima</w:t>
-      </w:r>
-      <w:r>
-        <w:rPr>
-          <w:rStyle w:val="NormalTok"/>
-        </w:rPr>
-        <w:t>(lake_train,</w:t>
-      </w:r>
-      <w:r>
-        <w:rPr>
-          <w:rStyle w:val="AttributeTok"/>
-        </w:rPr>
-        <w:t>order =</w:t>
-      </w:r>
-      <w:r>
-        <w:rPr>
-          <w:rStyle w:val="FunctionTok"/>
-        </w:rPr>
-        <w:t>c</w:t>
-      </w:r>
-      <w:r>
-        <w:rPr>
-          <w:rStyle w:val="NormalTok"/>
-        </w:rPr>
-        <w:t>(</w:t>
-      </w:r>
-      <w:r>
-        <w:rPr>
-          <w:rStyle w:val="DecValTok"/>
-        </w:rPr>
-        <w:t>1</w:t>
-      </w:r>
-      <w:r>
-        <w:rPr>
-          <w:rStyle w:val="NormalTok"/>
-        </w:rPr>
-        <w:t>,</w:t>
-      </w:r>
-      <w:r>
-        <w:rPr>
-          <w:rStyle w:val="DecValTok"/>
-        </w:rPr>
-        <w:t>1</w:t>
-      </w:r>
-      <w:r>
-        <w:rPr>
-          <w:rStyle w:val="NormalTok"/>
-        </w:rPr>
-        <w:t>,</w:t>
-      </w:r>
-      <w:r>
-        <w:rPr>
-          <w:rStyle w:val="DecValTok"/>
-        </w:rPr>
-        <w:t>0</w:t>
-      </w:r>
-      <w:r>
-        <w:rPr>
-          <w:rStyle w:val="NormalTok"/>
-        </w:rPr>
-        <w:t>))</w:t>
+        <w:t>auto.arima</w:t>
+      </w:r>
+      <w:r>
+        <w:rPr>
+          <w:rStyle w:val="NormalTok"/>
+        </w:rPr>
+        <w:t>(lake_train)</w:t>
       </w:r>
       <w:r>
         <w:br/>
@@ -1726,7 +1914,7 @@
         <w:rPr>
           <w:rStyle w:val="NormalTok"/>
         </w:rPr>
-        <w:t>(manual_2)</w:t>
+        <w:t>(model)</w:t>
       </w:r>
     </w:p>
     <w:p>
@@ -1737,6 +1925,24 @@
         <w:rPr>
           <w:rStyle w:val="VerbatimChar"/>
         </w:rPr>
+        <w:t xml:space="preserve">## Series: lake_train </w:t>
+      </w:r>
+      <w:r>
+        <w:br/>
+      </w:r>
+      <w:r>
+        <w:rPr>
+          <w:rStyle w:val="VerbatimChar"/>
+        </w:rPr>
+        <w:t xml:space="preserve">## ARIMA(0,1,0) </w:t>
+      </w:r>
+      <w:r>
+        <w:br/>
+      </w:r>
+      <w:r>
+        <w:rPr>
+          <w:rStyle w:val="VerbatimChar"/>
+        </w:rPr>
         <w:t xml:space="preserve">## </w:t>
       </w:r>
       <w:r>
@@ -1746,191 +1952,13 @@
         <w:rPr>
           <w:rStyle w:val="VerbatimChar"/>
         </w:rPr>
-        <w:t>## Call:</w:t>
-      </w:r>
-      <w:r>
-        <w:br/>
-      </w:r>
-      <w:r>
-        <w:rPr>
-          <w:rStyle w:val="VerbatimChar"/>
-        </w:rPr>
-        <w:t>## arima(x = lake_train, order = c(1, 1, 0))</w:t>
-      </w:r>
-      <w:r>
-        <w:br/>
-      </w:r>
-      <w:r>
-        <w:rPr>
-          <w:rStyle w:val="VerbatimChar"/>
-        </w:rPr>
-        <w:t xml:space="preserve">## </w:t>
-      </w:r>
-      <w:r>
-        <w:br/>
-      </w:r>
-      <w:r>
-        <w:rPr>
-          <w:rStyle w:val="VerbatimChar"/>
-        </w:rPr>
-        <w:t>## Coefficients:</w:t>
-      </w:r>
-      <w:r>
-        <w:br/>
-      </w:r>
-      <w:r>
-        <w:rPr>
-          <w:rStyle w:val="VerbatimChar"/>
-        </w:rPr>
-        <w:t>##          ar1</w:t>
-      </w:r>
-      <w:r>
-        <w:br/>
-      </w:r>
-      <w:r>
-        <w:rPr>
-          <w:rStyle w:val="VerbatimChar"/>
-        </w:rPr>
-        <w:t>##       0.1105</w:t>
-      </w:r>
-      <w:r>
-        <w:br/>
-      </w:r>
-      <w:r>
-        <w:rPr>
-          <w:rStyle w:val="VerbatimChar"/>
-        </w:rPr>
-        <w:t>## s.e.  0.1175</w:t>
-      </w:r>
-      <w:r>
-        <w:br/>
-      </w:r>
-      <w:r>
-        <w:rPr>
-          <w:rStyle w:val="VerbatimChar"/>
-        </w:rPr>
-        <w:t xml:space="preserve">## </w:t>
-      </w:r>
-      <w:r>
-        <w:br/>
-      </w:r>
-      <w:r>
-        <w:rPr>
-          <w:rStyle w:val="VerbatimChar"/>
-        </w:rPr>
-        <w:t>## sigma^2 estimated as 0.4855:  log likelihood = -79.33,  aic = 162.65</w:t>
-      </w:r>
-    </w:p>
-    <w:p>
-      <w:pPr>
-        <w:pStyle w:val="SourceCode"/>
-      </w:pPr>
-      <w:r>
-        <w:rPr>
-          <w:rStyle w:val="CommentTok"/>
-        </w:rPr>
-        <w:t>#using autoarima</w:t>
-      </w:r>
-      <w:r>
-        <w:br/>
-      </w:r>
-      <w:r>
-        <w:rPr>
-          <w:rStyle w:val="FunctionTok"/>
-        </w:rPr>
-        <w:t>library</w:t>
-      </w:r>
-      <w:r>
-        <w:rPr>
-          <w:rStyle w:val="NormalTok"/>
-        </w:rPr>
-        <w:t>(forecast)</w:t>
-      </w:r>
-      <w:r>
-        <w:br/>
-      </w:r>
-      <w:r>
-        <w:rPr>
-          <w:rStyle w:val="NormalTok"/>
-        </w:rPr>
-        <w:t>model</w:t>
-      </w:r>
-      <w:r>
-        <w:rPr>
-          <w:rStyle w:val="OtherTok"/>
-        </w:rPr>
-        <w:t>=</w:t>
-      </w:r>
-      <w:r>
-        <w:rPr>
-          <w:rStyle w:val="FunctionTok"/>
-        </w:rPr>
-        <w:t>auto.arima</w:t>
-      </w:r>
-      <w:r>
-        <w:rPr>
-          <w:rStyle w:val="NormalTok"/>
-        </w:rPr>
-        <w:t>(lake_train)</w:t>
-      </w:r>
-      <w:r>
-        <w:br/>
-      </w:r>
-      <w:r>
-        <w:rPr>
-          <w:rStyle w:val="FunctionTok"/>
-        </w:rPr>
-        <w:t>print</w:t>
-      </w:r>
-      <w:r>
-        <w:rPr>
-          <w:rStyle w:val="NormalTok"/>
-        </w:rPr>
-        <w:t>(model)</w:t>
-      </w:r>
-    </w:p>
-    <w:p>
-      <w:pPr>
-        <w:pStyle w:val="SourceCode"/>
-      </w:pPr>
-      <w:r>
-        <w:rPr>
-          <w:rStyle w:val="VerbatimChar"/>
-        </w:rPr>
-        <w:t xml:space="preserve">## Series: lake_train </w:t>
-      </w:r>
-      <w:r>
-        <w:br/>
-      </w:r>
-      <w:r>
-        <w:rPr>
-          <w:rStyle w:val="VerbatimChar"/>
-        </w:rPr>
-        <w:t xml:space="preserve">## ARIMA(0,1,0) </w:t>
-      </w:r>
-      <w:r>
-        <w:br/>
-      </w:r>
-      <w:r>
-        <w:rPr>
-          <w:rStyle w:val="VerbatimChar"/>
-        </w:rPr>
-        <w:t xml:space="preserve">## </w:t>
-      </w:r>
-      <w:r>
-        <w:br/>
-      </w:r>
-      <w:r>
-        <w:rPr>
-          <w:rStyle w:val="VerbatimChar"/>
-        </w:rPr>
-        <w:t>## sigma^2 = 0.4958:  log likelihood = -79.</w:t>
-      </w:r>
-      <w:r>
-        <w:rPr>
-          <w:rStyle w:val="VerbatimChar"/>
-        </w:rPr>
-        <w:t>77</w:t>
+        <w:t>## sigma^2 = 0</w:t>
+      </w:r>
+      <w:r>
+        <w:rPr>
+          <w:rStyle w:val="VerbatimChar"/>
+        </w:rPr>
+        <w:t>.4958:  log likelihood = -79.77</w:t>
       </w:r>
       <w:r>
         <w:br/>
@@ -2133,7 +2161,7 @@
               <a:graphicData uri="http://schemas.openxmlformats.org/drawingml/2006/picture">
                 <pic:pic xmlns:pic="http://schemas.openxmlformats.org/drawingml/2006/picture">
                   <pic:nvPicPr>
-                    <pic:cNvPr id="31" name="Picture" descr="lakehuron_files/figure-docx/unnamed-chunk-1-4.png"/>
+                    <pic:cNvPr id="31" name="Picture" descr="LAKEHURON_files/figure-docx/unnamed-chunk-1-4.png"/>
                     <pic:cNvPicPr>
                       <a:picLocks noChangeAspect="1" noChangeArrowheads="1"/>
                     </pic:cNvPicPr>
@@ -2239,7 +2267,13 @@
         <w:rPr>
           <w:rStyle w:val="FunctionTok"/>
         </w:rPr>
-        <w:t>checkresiduals</w:t>
+        <w:t>checkresidu</w:t>
+      </w:r>
+      <w:r>
+        <w:rPr>
+          <w:rStyle w:val="FunctionTok"/>
+        </w:rPr>
+        <w:t>als</w:t>
       </w:r>
       <w:r>
         <w:rPr>
@@ -2268,7 +2302,7 @@
               <a:graphicData uri="http://schemas.openxmlformats.org/drawingml/2006/picture">
                 <pic:pic xmlns:pic="http://schemas.openxmlformats.org/drawingml/2006/picture">
                   <pic:nvPicPr>
-                    <pic:cNvPr id="34" name="Picture" descr="lakehuron_files/figure-docx/unnamed-chunk-1-5.png"/>
+                    <pic:cNvPr id="34" name="Picture" descr="LAKEHURON_files/figure-docx/unnamed-chunk-1-5.png"/>
                     <pic:cNvPicPr>
                       <a:picLocks noChangeAspect="1" noChangeArrowheads="1"/>
                     </pic:cNvPicPr>
@@ -2345,13 +2379,7 @@
         <w:rPr>
           <w:rStyle w:val="VerbatimChar"/>
         </w:rPr>
-        <w:t>## Q*</w:t>
-      </w:r>
-      <w:r>
-        <w:rPr>
-          <w:rStyle w:val="VerbatimChar"/>
-        </w:rPr>
-        <w:t xml:space="preserve"> = 11.047, df = 10, p-value = 0.3538</w:t>
+        <w:t>## Q* = 11.047, df = 10, p-value = 0.3538</w:t>
       </w:r>
       <w:r>
         <w:br/>
@@ -2407,7 +2435,7 @@
         <w:rPr>
           <w:rStyle w:val="NormalTok"/>
         </w:rPr>
-        <w:t>(manual_3),</w:t>
+        <w:t>(manual),</w:t>
       </w:r>
       <w:r>
         <w:rPr>
@@ -2437,7 +2465,7 @@
         <w:rPr>
           <w:rStyle w:val="StringTok"/>
         </w:rPr>
-        <w:t>'arima(0,1,0) fitted vs actual'</w:t>
+        <w:t>'arima(1,1,2) fitted vs actual'</w:t>
       </w:r>
       <w:r>
         <w:rPr>
@@ -2616,7 +2644,7 @@
               <a:graphicData uri="http://schemas.openxmlformats.org/drawingml/2006/picture">
                 <pic:pic xmlns:pic="http://schemas.openxmlformats.org/drawingml/2006/picture">
                   <pic:nvPicPr>
-                    <pic:cNvPr id="37" name="Picture" descr="lakehuron_files/figure-docx/unnamed-chunk-1-6.png"/>
+                    <pic:cNvPr id="37" name="Picture" descr="LAKEHURON_files/figure-docx/unnamed-chunk-1-6.png"/>
                     <pic:cNvPicPr>
                       <a:picLocks noChangeAspect="1" noChangeArrowheads="1"/>
                     </pic:cNvPicPr>
@@ -2657,6 +2685,1007 @@
         <w:rPr>
           <w:rStyle w:val="CommentTok"/>
         </w:rPr>
+        <w:t>#model comaparison</w:t>
+      </w:r>
+      <w:r>
+        <w:br/>
+      </w:r>
+      <w:r>
+        <w:rPr>
+          <w:rStyle w:val="NormalTok"/>
+        </w:rPr>
+        <w:t>accuracy</w:t>
+      </w:r>
+      <w:r>
+        <w:rPr>
+          <w:rStyle w:val="OtherTok"/>
+        </w:rPr>
+        <w:t>=</w:t>
+      </w:r>
+      <w:r>
+        <w:rPr>
+          <w:rStyle w:val="NormalTok"/>
+        </w:rPr>
+        <w:t>forecast_lake</w:t>
+      </w:r>
+      <w:r>
+        <w:rPr>
+          <w:rStyle w:val="SpecialCharTok"/>
+        </w:rPr>
+        <w:t>$</w:t>
+      </w:r>
+      <w:r>
+        <w:rPr>
+          <w:rStyle w:val="NormalTok"/>
+        </w:rPr>
+        <w:t>mean</w:t>
+      </w:r>
+      <w:r>
+        <w:rPr>
+          <w:rStyle w:val="SpecialCharTok"/>
+        </w:rPr>
+        <w:t>-</w:t>
+      </w:r>
+      <w:r>
+        <w:rPr>
+          <w:rStyle w:val="NormalTok"/>
+        </w:rPr>
+        <w:t>lake_test</w:t>
+      </w:r>
+      <w:r>
+        <w:br/>
+      </w:r>
+      <w:r>
+        <w:rPr>
+          <w:rStyle w:val="NormalTok"/>
+        </w:rPr>
+        <w:t>rmse</w:t>
+      </w:r>
+      <w:r>
+        <w:rPr>
+          <w:rStyle w:val="OtherTok"/>
+        </w:rPr>
+        <w:t>=</w:t>
+      </w:r>
+      <w:r>
+        <w:rPr>
+          <w:rStyle w:val="FunctionTok"/>
+        </w:rPr>
+        <w:t>sqrt</w:t>
+      </w:r>
+      <w:r>
+        <w:rPr>
+          <w:rStyle w:val="NormalTok"/>
+        </w:rPr>
+        <w:t>(</w:t>
+      </w:r>
+      <w:r>
+        <w:rPr>
+          <w:rStyle w:val="FunctionTok"/>
+        </w:rPr>
+        <w:t>mean</w:t>
+      </w:r>
+      <w:r>
+        <w:rPr>
+          <w:rStyle w:val="NormalTok"/>
+        </w:rPr>
+        <w:t>(accuracy</w:t>
+      </w:r>
+      <w:r>
+        <w:rPr>
+          <w:rStyle w:val="SpecialCharTok"/>
+        </w:rPr>
+        <w:t>^</w:t>
+      </w:r>
+      <w:r>
+        <w:rPr>
+          <w:rStyle w:val="DecValTok"/>
+        </w:rPr>
+        <w:t>2</w:t>
+      </w:r>
+      <w:r>
+        <w:rPr>
+          <w:rStyle w:val="NormalTok"/>
+        </w:rPr>
+        <w:t>))</w:t>
+      </w:r>
+      <w:r>
+        <w:br/>
+      </w:r>
+      <w:r>
+        <w:rPr>
+          <w:rStyle w:val="FunctionTok"/>
+        </w:rPr>
+        <w:t>print</w:t>
+      </w:r>
+      <w:r>
+        <w:rPr>
+          <w:rStyle w:val="NormalTok"/>
+        </w:rPr>
+        <w:t>(rmse)</w:t>
+      </w:r>
+    </w:p>
+    <w:p>
+      <w:pPr>
+        <w:pStyle w:val="SourceCode"/>
+      </w:pPr>
+      <w:r>
+        <w:rPr>
+          <w:rStyle w:val="VerbatimChar"/>
+        </w:rPr>
+        <w:t>## [1] 1.327737</w:t>
+      </w:r>
+    </w:p>
+    <w:p>
+      <w:pPr>
+        <w:pStyle w:val="SourceCode"/>
+      </w:pPr>
+      <w:r>
+        <w:rPr>
+          <w:rStyle w:val="FunctionTok"/>
+        </w:rPr>
+        <w:t>cat</w:t>
+      </w:r>
+      <w:r>
+        <w:rPr>
+          <w:rStyle w:val="NormalTok"/>
+        </w:rPr>
+        <w:t>(</w:t>
+      </w:r>
+      <w:r>
+        <w:rPr>
+          <w:rStyle w:val="StringTok"/>
+        </w:rPr>
+        <w:t>"test error n 22 data points"</w:t>
+      </w:r>
+      <w:r>
+        <w:rPr>
+          <w:rStyle w:val="NormalTok"/>
+        </w:rPr>
+        <w:t>,</w:t>
+      </w:r>
+      <w:r>
+        <w:rPr>
+          <w:rStyle w:val="FunctionTok"/>
+        </w:rPr>
+        <w:t>sum</w:t>
+      </w:r>
+      <w:r>
+        <w:rPr>
+          <w:rStyle w:val="NormalTok"/>
+        </w:rPr>
+        <w:t>(accuracy</w:t>
+      </w:r>
+      <w:r>
+        <w:rPr>
+          <w:rStyle w:val="SpecialCharTok"/>
+        </w:rPr>
+        <w:t>^</w:t>
+      </w:r>
+      <w:r>
+        <w:rPr>
+          <w:rStyle w:val="DecValTok"/>
+        </w:rPr>
+        <w:t>2</w:t>
+      </w:r>
+      <w:r>
+        <w:rPr>
+          <w:rStyle w:val="NormalTok"/>
+        </w:rPr>
+        <w:t>),</w:t>
+      </w:r>
+      <w:r>
+        <w:rPr>
+          <w:rStyle w:val="StringTok"/>
+        </w:rPr>
+        <w:t>'</w:t>
+      </w:r>
+      <w:r>
+        <w:rPr>
+          <w:rStyle w:val="SpecialCharTok"/>
+        </w:rPr>
+        <w:t>\n</w:t>
+      </w:r>
+      <w:r>
+        <w:rPr>
+          <w:rStyle w:val="StringTok"/>
+        </w:rPr>
+        <w:t>'</w:t>
+      </w:r>
+      <w:r>
+        <w:rPr>
+          <w:rStyle w:val="NormalTok"/>
+        </w:rPr>
+        <w:t>)</w:t>
+      </w:r>
+    </w:p>
+    <w:p>
+      <w:pPr>
+        <w:pStyle w:val="SourceCode"/>
+      </w:pPr>
+      <w:r>
+        <w:rPr>
+          <w:rStyle w:val="VerbatimChar"/>
+        </w:rPr>
+        <w:t>## test error n 22 data points 38.78347</w:t>
+      </w:r>
+    </w:p>
+    <w:p>
+      <w:pPr>
+        <w:pStyle w:val="SourceCode"/>
+      </w:pPr>
+      <w:r>
+        <w:rPr>
+          <w:rStyle w:val="FunctionTok"/>
+        </w:rPr>
+        <w:t>cat</w:t>
+      </w:r>
+      <w:r>
+        <w:rPr>
+          <w:rStyle w:val="NormalTok"/>
+        </w:rPr>
+        <w:t>(</w:t>
+      </w:r>
+      <w:r>
+        <w:rPr>
+          <w:rStyle w:val="StringTok"/>
+        </w:rPr>
+        <w:t>'train_error'</w:t>
+      </w:r>
+      <w:r>
+        <w:rPr>
+          <w:rStyle w:val="NormalTok"/>
+        </w:rPr>
+        <w:t>,manual</w:t>
+      </w:r>
+      <w:r>
+        <w:rPr>
+          <w:rStyle w:val="SpecialCharTok"/>
+        </w:rPr>
+        <w:t>$</w:t>
+      </w:r>
+      <w:r>
+        <w:rPr>
+          <w:rStyle w:val="NormalTok"/>
+        </w:rPr>
+        <w:t>sigma2)</w:t>
+      </w:r>
+    </w:p>
+    <w:p>
+      <w:pPr>
+        <w:pStyle w:val="SourceCode"/>
+      </w:pPr>
+      <w:r>
+        <w:rPr>
+          <w:rStyle w:val="VerbatimChar"/>
+        </w:rPr>
+        <w:t>## train_error 0.4258698</w:t>
+      </w:r>
+    </w:p>
+    <w:p>
+      <w:pPr>
+        <w:pStyle w:val="SourceCode"/>
+      </w:pPr>
+      <w:r>
+        <w:rPr>
+          <w:rStyle w:val="NormalTok"/>
+        </w:rPr>
+        <w:t>forecast_lake_1</w:t>
+      </w:r>
+      <w:r>
+        <w:rPr>
+          <w:rStyle w:val="OtherTok"/>
+        </w:rPr>
+        <w:t>=</w:t>
+      </w:r>
+      <w:r>
+        <w:rPr>
+          <w:rStyle w:val="FunctionTok"/>
+        </w:rPr>
+        <w:t>forecast</w:t>
+      </w:r>
+      <w:r>
+        <w:rPr>
+          <w:rStyle w:val="NormalTok"/>
+        </w:rPr>
+        <w:t>(manual_3,</w:t>
+      </w:r>
+      <w:r>
+        <w:rPr>
+          <w:rStyle w:val="AttributeTok"/>
+        </w:rPr>
+        <w:t>h=</w:t>
+      </w:r>
+      <w:r>
+        <w:rPr>
+          <w:rStyle w:val="DecValTok"/>
+        </w:rPr>
+        <w:t>22</w:t>
+      </w:r>
+      <w:r>
+        <w:rPr>
+          <w:rStyle w:val="NormalTok"/>
+        </w:rPr>
+        <w:t>,</w:t>
+      </w:r>
+      <w:r>
+        <w:rPr>
+          <w:rStyle w:val="AttributeTok"/>
+        </w:rPr>
+        <w:t>level=</w:t>
+      </w:r>
+      <w:r>
+        <w:rPr>
+          <w:rStyle w:val="FunctionTok"/>
+        </w:rPr>
+        <w:t>c</w:t>
+      </w:r>
+      <w:r>
+        <w:rPr>
+          <w:rStyle w:val="NormalTok"/>
+        </w:rPr>
+        <w:t>(</w:t>
+      </w:r>
+      <w:r>
+        <w:rPr>
+          <w:rStyle w:val="DecValTok"/>
+        </w:rPr>
+        <w:t>85</w:t>
+      </w:r>
+      <w:r>
+        <w:rPr>
+          <w:rStyle w:val="NormalTok"/>
+        </w:rPr>
+        <w:t>,</w:t>
+      </w:r>
+      <w:r>
+        <w:rPr>
+          <w:rStyle w:val="DecValTok"/>
+        </w:rPr>
+        <w:t>95</w:t>
+      </w:r>
+      <w:r>
+        <w:rPr>
+          <w:rStyle w:val="NormalTok"/>
+        </w:rPr>
+        <w:t>))</w:t>
+      </w:r>
+      <w:r>
+        <w:br/>
+      </w:r>
+      <w:r>
+        <w:rPr>
+          <w:rStyle w:val="NormalTok"/>
+        </w:rPr>
+        <w:t>accuracy_1</w:t>
+      </w:r>
+      <w:r>
+        <w:rPr>
+          <w:rStyle w:val="OtherTok"/>
+        </w:rPr>
+        <w:t>=</w:t>
+      </w:r>
+      <w:r>
+        <w:rPr>
+          <w:rStyle w:val="NormalTok"/>
+        </w:rPr>
+        <w:t>forecast_lake_1</w:t>
+      </w:r>
+      <w:r>
+        <w:rPr>
+          <w:rStyle w:val="SpecialCharTok"/>
+        </w:rPr>
+        <w:t>$</w:t>
+      </w:r>
+      <w:r>
+        <w:rPr>
+          <w:rStyle w:val="NormalTok"/>
+        </w:rPr>
+        <w:t>mean</w:t>
+      </w:r>
+      <w:r>
+        <w:rPr>
+          <w:rStyle w:val="SpecialCharTok"/>
+        </w:rPr>
+        <w:t>-</w:t>
+      </w:r>
+      <w:r>
+        <w:rPr>
+          <w:rStyle w:val="NormalTok"/>
+        </w:rPr>
+        <w:t>lake_test</w:t>
+      </w:r>
+      <w:r>
+        <w:br/>
+      </w:r>
+      <w:r>
+        <w:rPr>
+          <w:rStyle w:val="NormalTok"/>
+        </w:rPr>
+        <w:t>rmse_3</w:t>
+      </w:r>
+      <w:r>
+        <w:rPr>
+          <w:rStyle w:val="OtherTok"/>
+        </w:rPr>
+        <w:t>=</w:t>
+      </w:r>
+      <w:r>
+        <w:rPr>
+          <w:rStyle w:val="FunctionTok"/>
+        </w:rPr>
+        <w:t>sqrt</w:t>
+      </w:r>
+      <w:r>
+        <w:rPr>
+          <w:rStyle w:val="NormalTok"/>
+        </w:rPr>
+        <w:t>(</w:t>
+      </w:r>
+      <w:r>
+        <w:rPr>
+          <w:rStyle w:val="FunctionTok"/>
+        </w:rPr>
+        <w:t>mean</w:t>
+      </w:r>
+      <w:r>
+        <w:rPr>
+          <w:rStyle w:val="NormalTok"/>
+        </w:rPr>
+        <w:t>(accuracy_1</w:t>
+      </w:r>
+      <w:r>
+        <w:rPr>
+          <w:rStyle w:val="SpecialCharTok"/>
+        </w:rPr>
+        <w:t>^</w:t>
+      </w:r>
+      <w:r>
+        <w:rPr>
+          <w:rStyle w:val="DecValTok"/>
+        </w:rPr>
+        <w:t>2</w:t>
+      </w:r>
+      <w:r>
+        <w:rPr>
+          <w:rStyle w:val="NormalTok"/>
+        </w:rPr>
+        <w:t>))</w:t>
+      </w:r>
+      <w:r>
+        <w:br/>
+      </w:r>
+      <w:r>
+        <w:rPr>
+          <w:rStyle w:val="FunctionTok"/>
+        </w:rPr>
+        <w:t>print</w:t>
+      </w:r>
+      <w:r>
+        <w:rPr>
+          <w:rStyle w:val="NormalTok"/>
+        </w:rPr>
+        <w:t>(rmse_3)</w:t>
+      </w:r>
+    </w:p>
+    <w:p>
+      <w:pPr>
+        <w:pStyle w:val="SourceCode"/>
+      </w:pPr>
+      <w:r>
+        <w:rPr>
+          <w:rStyle w:val="VerbatimChar"/>
+        </w:rPr>
+        <w:t>## [1] 1.399732</w:t>
+      </w:r>
+    </w:p>
+    <w:p>
+      <w:pPr>
+        <w:pStyle w:val="SourceCode"/>
+      </w:pPr>
+      <w:r>
+        <w:rPr>
+          <w:rStyle w:val="FunctionTok"/>
+        </w:rPr>
+        <w:t>cat</w:t>
+      </w:r>
+      <w:r>
+        <w:rPr>
+          <w:rStyle w:val="NormalTok"/>
+        </w:rPr>
+        <w:t>(</w:t>
+      </w:r>
+      <w:r>
+        <w:rPr>
+          <w:rStyle w:val="StringTok"/>
+        </w:rPr>
+        <w:t>"test error n 22 data points"</w:t>
+      </w:r>
+      <w:r>
+        <w:rPr>
+          <w:rStyle w:val="NormalTok"/>
+        </w:rPr>
+        <w:t>,</w:t>
+      </w:r>
+      <w:r>
+        <w:rPr>
+          <w:rStyle w:val="FunctionTok"/>
+        </w:rPr>
+        <w:t>sum</w:t>
+      </w:r>
+      <w:r>
+        <w:rPr>
+          <w:rStyle w:val="NormalTok"/>
+        </w:rPr>
+        <w:t>(accuracy_1</w:t>
+      </w:r>
+      <w:r>
+        <w:rPr>
+          <w:rStyle w:val="SpecialCharTok"/>
+        </w:rPr>
+        <w:t>^</w:t>
+      </w:r>
+      <w:r>
+        <w:rPr>
+          <w:rStyle w:val="DecValTok"/>
+        </w:rPr>
+        <w:t>2</w:t>
+      </w:r>
+      <w:r>
+        <w:rPr>
+          <w:rStyle w:val="NormalTok"/>
+        </w:rPr>
+        <w:t>),</w:t>
+      </w:r>
+      <w:r>
+        <w:rPr>
+          <w:rStyle w:val="StringTok"/>
+        </w:rPr>
+        <w:t>'</w:t>
+      </w:r>
+      <w:r>
+        <w:rPr>
+          <w:rStyle w:val="SpecialCharTok"/>
+        </w:rPr>
+        <w:t>\n</w:t>
+      </w:r>
+      <w:r>
+        <w:rPr>
+          <w:rStyle w:val="StringTok"/>
+        </w:rPr>
+        <w:t>'</w:t>
+      </w:r>
+      <w:r>
+        <w:rPr>
+          <w:rStyle w:val="NormalTok"/>
+        </w:rPr>
+        <w:t>)</w:t>
+      </w:r>
+    </w:p>
+    <w:p>
+      <w:pPr>
+        <w:pStyle w:val="SourceCode"/>
+      </w:pPr>
+      <w:r>
+        <w:rPr>
+          <w:rStyle w:val="VerbatimChar"/>
+        </w:rPr>
+        <w:t>## test error n 22 data points 43.1035</w:t>
+      </w:r>
+    </w:p>
+    <w:p>
+      <w:pPr>
+        <w:pStyle w:val="SourceCode"/>
+      </w:pPr>
+      <w:r>
+        <w:rPr>
+          <w:rStyle w:val="FunctionTok"/>
+        </w:rPr>
+        <w:t>cat</w:t>
+      </w:r>
+      <w:r>
+        <w:rPr>
+          <w:rStyle w:val="NormalTok"/>
+        </w:rPr>
+        <w:t>(</w:t>
+      </w:r>
+      <w:r>
+        <w:rPr>
+          <w:rStyle w:val="StringTok"/>
+        </w:rPr>
+        <w:t>'train_error'</w:t>
+      </w:r>
+      <w:r>
+        <w:rPr>
+          <w:rStyle w:val="NormalTok"/>
+        </w:rPr>
+        <w:t>,manual_3</w:t>
+      </w:r>
+      <w:r>
+        <w:rPr>
+          <w:rStyle w:val="SpecialCharTok"/>
+        </w:rPr>
+        <w:t>$</w:t>
+      </w:r>
+      <w:r>
+        <w:rPr>
+          <w:rStyle w:val="NormalTok"/>
+        </w:rPr>
+        <w:t>sigma2)</w:t>
+      </w:r>
+    </w:p>
+    <w:p>
+      <w:pPr>
+        <w:pStyle w:val="SourceCode"/>
+      </w:pPr>
+      <w:r>
+        <w:rPr>
+          <w:rStyle w:val="VerbatimChar"/>
+        </w:rPr>
+        <w:t>## train_error 0.491264</w:t>
+      </w:r>
+    </w:p>
+    <w:p>
+      <w:pPr>
+        <w:pStyle w:val="SourceCode"/>
+      </w:pPr>
+      <w:r>
+        <w:rPr>
+          <w:rStyle w:val="NormalTok"/>
+        </w:rPr>
+        <w:lastRenderedPageBreak/>
+        <w:t>forecast_comparison</w:t>
+      </w:r>
+      <w:r>
+        <w:rPr>
+          <w:rStyle w:val="OtherTok"/>
+        </w:rPr>
+        <w:t>=</w:t>
+      </w:r>
+      <w:r>
+        <w:rPr>
+          <w:rStyle w:val="FunctionTok"/>
+        </w:rPr>
+        <w:t>data.frame</w:t>
+      </w:r>
+      <w:r>
+        <w:rPr>
+          <w:rStyle w:val="NormalTok"/>
+        </w:rPr>
+        <w:t>(</w:t>
+      </w:r>
+      <w:r>
+        <w:br/>
+      </w:r>
+      <w:r>
+        <w:rPr>
+          <w:rStyle w:val="NormalTok"/>
+        </w:rPr>
+        <w:t xml:space="preserve">  </w:t>
+      </w:r>
+      <w:r>
+        <w:br/>
+      </w:r>
+      <w:r>
+        <w:rPr>
+          <w:rStyle w:val="NormalTok"/>
+        </w:rPr>
+        <w:t xml:space="preserve">  </w:t>
+      </w:r>
+      <w:r>
+        <w:rPr>
+          <w:rStyle w:val="AttributeTok"/>
+        </w:rPr>
+        <w:t>model=</w:t>
+      </w:r>
+      <w:r>
+        <w:rPr>
+          <w:rStyle w:val="FunctionTok"/>
+        </w:rPr>
+        <w:t>c</w:t>
+      </w:r>
+      <w:r>
+        <w:rPr>
+          <w:rStyle w:val="NormalTok"/>
+        </w:rPr>
+        <w:t>(</w:t>
+      </w:r>
+      <w:r>
+        <w:br/>
+      </w:r>
+      <w:r>
+        <w:rPr>
+          <w:rStyle w:val="NormalTok"/>
+        </w:rPr>
+        <w:t xml:space="preserve">    </w:t>
+      </w:r>
+      <w:r>
+        <w:rPr>
+          <w:rStyle w:val="StringTok"/>
+        </w:rPr>
+        <w:t>"arima(0,1,0)"</w:t>
+      </w:r>
+      <w:r>
+        <w:rPr>
+          <w:rStyle w:val="NormalTok"/>
+        </w:rPr>
+        <w:t>,</w:t>
+      </w:r>
+      <w:r>
+        <w:br/>
+      </w:r>
+      <w:r>
+        <w:rPr>
+          <w:rStyle w:val="NormalTok"/>
+        </w:rPr>
+        <w:t xml:space="preserve">    </w:t>
+      </w:r>
+      <w:r>
+        <w:br/>
+      </w:r>
+      <w:r>
+        <w:rPr>
+          <w:rStyle w:val="NormalTok"/>
+        </w:rPr>
+        <w:t xml:space="preserve">    </w:t>
+      </w:r>
+      <w:r>
+        <w:rPr>
+          <w:rStyle w:val="StringTok"/>
+        </w:rPr>
+        <w:t>"arima(1,1,2)"</w:t>
+      </w:r>
+      <w:r>
+        <w:br/>
+      </w:r>
+      <w:r>
+        <w:rPr>
+          <w:rStyle w:val="NormalTok"/>
+        </w:rPr>
+        <w:t xml:space="preserve">  ),</w:t>
+      </w:r>
+      <w:r>
+        <w:br/>
+      </w:r>
+      <w:r>
+        <w:rPr>
+          <w:rStyle w:val="NormalTok"/>
+        </w:rPr>
+        <w:t xml:space="preserve">  </w:t>
+      </w:r>
+      <w:r>
+        <w:rPr>
+          <w:rStyle w:val="AttributeTok"/>
+        </w:rPr>
+        <w:t>AIC=</w:t>
+      </w:r>
+      <w:r>
+        <w:rPr>
+          <w:rStyle w:val="FunctionTok"/>
+        </w:rPr>
+        <w:t>c</w:t>
+      </w:r>
+      <w:r>
+        <w:rPr>
+          <w:rStyle w:val="NormalTok"/>
+        </w:rPr>
+        <w:t>(</w:t>
+      </w:r>
+      <w:r>
+        <w:br/>
+      </w:r>
+      <w:r>
+        <w:rPr>
+          <w:rStyle w:val="NormalTok"/>
+        </w:rPr>
+        <w:t xml:space="preserve">    </w:t>
+      </w:r>
+      <w:r>
+        <w:br/>
+      </w:r>
+      <w:r>
+        <w:rPr>
+          <w:rStyle w:val="NormalTok"/>
+        </w:rPr>
+        <w:t xml:space="preserve">    </w:t>
+      </w:r>
+      <w:r>
+        <w:rPr>
+          <w:rStyle w:val="FunctionTok"/>
+        </w:rPr>
+        <w:t>AIC</w:t>
+      </w:r>
+      <w:r>
+        <w:rPr>
+          <w:rStyle w:val="NormalTok"/>
+        </w:rPr>
+        <w:t>(manual_3),</w:t>
+      </w:r>
+      <w:r>
+        <w:br/>
+      </w:r>
+      <w:r>
+        <w:rPr>
+          <w:rStyle w:val="NormalTok"/>
+        </w:rPr>
+        <w:t xml:space="preserve">    </w:t>
+      </w:r>
+      <w:r>
+        <w:rPr>
+          <w:rStyle w:val="FunctionTok"/>
+        </w:rPr>
+        <w:t>AIC</w:t>
+      </w:r>
+      <w:r>
+        <w:rPr>
+          <w:rStyle w:val="NormalTok"/>
+        </w:rPr>
+        <w:t>(manual)</w:t>
+      </w:r>
+      <w:r>
+        <w:br/>
+      </w:r>
+      <w:r>
+        <w:rPr>
+          <w:rStyle w:val="NormalTok"/>
+        </w:rPr>
+        <w:t xml:space="preserve">    </w:t>
+      </w:r>
+      <w:r>
+        <w:br/>
+      </w:r>
+      <w:r>
+        <w:rPr>
+          <w:rStyle w:val="NormalTok"/>
+        </w:rPr>
+        <w:t xml:space="preserve">  ),</w:t>
+      </w:r>
+      <w:r>
+        <w:br/>
+      </w:r>
+      <w:r>
+        <w:rPr>
+          <w:rStyle w:val="NormalTok"/>
+        </w:rPr>
+        <w:t xml:space="preserve">  </w:t>
+      </w:r>
+      <w:r>
+        <w:br/>
+      </w:r>
+      <w:r>
+        <w:rPr>
+          <w:rStyle w:val="NormalTok"/>
+        </w:rPr>
+        <w:t xml:space="preserve">  </w:t>
+      </w:r>
+      <w:r>
+        <w:rPr>
+          <w:rStyle w:val="AttributeTok"/>
+        </w:rPr>
+        <w:t>RMSE=</w:t>
+      </w:r>
+      <w:r>
+        <w:rPr>
+          <w:rStyle w:val="FunctionTok"/>
+        </w:rPr>
+        <w:t>c</w:t>
+      </w:r>
+      <w:r>
+        <w:rPr>
+          <w:rStyle w:val="NormalTok"/>
+        </w:rPr>
+        <w:t>(</w:t>
+      </w:r>
+      <w:r>
+        <w:br/>
+      </w:r>
+      <w:r>
+        <w:rPr>
+          <w:rStyle w:val="NormalTok"/>
+        </w:rPr>
+        <w:t xml:space="preserve">    </w:t>
+      </w:r>
+      <w:r>
+        <w:br/>
+      </w:r>
+      <w:r>
+        <w:rPr>
+          <w:rStyle w:val="NormalTok"/>
+        </w:rPr>
+        <w:t xml:space="preserve">    rmse_3,</w:t>
+      </w:r>
+      <w:r>
+        <w:br/>
+      </w:r>
+      <w:r>
+        <w:rPr>
+          <w:rStyle w:val="NormalTok"/>
+        </w:rPr>
+        <w:t xml:space="preserve">    rmse</w:t>
+      </w:r>
+      <w:r>
+        <w:br/>
+      </w:r>
+      <w:r>
+        <w:rPr>
+          <w:rStyle w:val="NormalTok"/>
+        </w:rPr>
+        <w:t xml:space="preserve">    </w:t>
+      </w:r>
+      <w:r>
+        <w:br/>
+      </w:r>
+      <w:r>
+        <w:rPr>
+          <w:rStyle w:val="NormalTok"/>
+        </w:rPr>
+        <w:t xml:space="preserve">    )</w:t>
+      </w:r>
+      <w:r>
+        <w:br/>
+      </w:r>
+      <w:r>
+        <w:rPr>
+          <w:rStyle w:val="NormalTok"/>
+        </w:rPr>
+        <w:t xml:space="preserve">  )</w:t>
+      </w:r>
+      <w:r>
+        <w:br/>
+      </w:r>
+      <w:r>
+        <w:br/>
+      </w:r>
+      <w:r>
+        <w:rPr>
+          <w:rStyle w:val="FunctionTok"/>
+        </w:rPr>
+        <w:t>print</w:t>
+      </w:r>
+      <w:r>
+        <w:rPr>
+          <w:rStyle w:val="NormalTok"/>
+        </w:rPr>
+        <w:t>(forecast_comparison)</w:t>
+      </w:r>
+    </w:p>
+    <w:p>
+      <w:pPr>
+        <w:pStyle w:val="SourceCode"/>
+      </w:pPr>
+      <w:r>
+        <w:rPr>
+          <w:rStyle w:val="VerbatimChar"/>
+        </w:rPr>
+        <w:t>##          model      AIC     RMSE</w:t>
+      </w:r>
+      <w:r>
+        <w:br/>
+      </w:r>
+      <w:r>
+        <w:rPr>
+          <w:rStyle w:val="VerbatimChar"/>
+        </w:rPr>
+        <w:t>## 1 arima(0,1,0) 161.5328 1.399732</w:t>
+      </w:r>
+      <w:r>
+        <w:br/>
+      </w:r>
+      <w:r>
+        <w:rPr>
+          <w:rStyle w:val="VerbatimChar"/>
+        </w:rPr>
+        <w:t>## 2 arima(1,1,2) 157.3585 1.327737</w:t>
+      </w:r>
+    </w:p>
+    <w:p>
+      <w:pPr>
+        <w:pStyle w:val="SourceCode"/>
+      </w:pPr>
+      <w:r>
+        <w:rPr>
+          <w:rStyle w:val="CommentTok"/>
+        </w:rPr>
         <w:t>#forecast plot</w:t>
       </w:r>
       <w:r>
@@ -2684,7 +3713,7 @@
         <w:rPr>
           <w:rStyle w:val="NormalTok"/>
         </w:rPr>
-        <w:t>(manual_3,</w:t>
+        <w:t>(manual,</w:t>
       </w:r>
       <w:r>
         <w:rPr>
@@ -2694,9 +3723,39 @@
       </w:r>
       <w:r>
         <w:rPr>
+          <w:rStyle w:val="FunctionTok"/>
+        </w:rPr>
+        <w:t>length</w:t>
+      </w:r>
+      <w:r>
+        <w:rPr>
+          <w:rStyle w:val="NormalTok"/>
+        </w:rPr>
+        <w:t>(lake_test),</w:t>
+      </w:r>
+      <w:r>
+        <w:rPr>
+          <w:rStyle w:val="AttributeTok"/>
+        </w:rPr>
+        <w:t>level=</w:t>
+      </w:r>
+      <w:r>
+        <w:rPr>
+          <w:rStyle w:val="FunctionTok"/>
+        </w:rPr>
+        <w:t>c</w:t>
+      </w:r>
+      <w:r>
+        <w:rPr>
+          <w:rStyle w:val="NormalTok"/>
+        </w:rPr>
+        <w:t>(</w:t>
+      </w:r>
+      <w:r>
+        <w:rPr>
           <w:rStyle w:val="DecValTok"/>
         </w:rPr>
-        <w:t>22</w:t>
+        <w:t>85</w:t>
       </w:r>
       <w:r>
         <w:rPr>
@@ -2706,72 +3765,42 @@
       </w:r>
       <w:r>
         <w:rPr>
+          <w:rStyle w:val="DecValTok"/>
+        </w:rPr>
+        <w:t>95</w:t>
+      </w:r>
+      <w:r>
+        <w:rPr>
+          <w:rStyle w:val="NormalTok"/>
+        </w:rPr>
+        <w:t>))</w:t>
+      </w:r>
+      <w:r>
+        <w:br/>
+      </w:r>
+      <w:r>
+        <w:rPr>
+          <w:rStyle w:val="FunctionTok"/>
+        </w:rPr>
+        <w:t>autoplot</w:t>
+      </w:r>
+      <w:r>
+        <w:rPr>
+          <w:rStyle w:val="NormalTok"/>
+        </w:rPr>
+        <w:t>(forecast_lake,</w:t>
+      </w:r>
+      <w:r>
+        <w:rPr>
           <w:rStyle w:val="AttributeTok"/>
         </w:rPr>
-        <w:t>level=</w:t>
-      </w:r>
-      <w:r>
-        <w:rPr>
-          <w:rStyle w:val="FunctionTok"/>
-        </w:rPr>
-        <w:t>c</w:t>
-      </w:r>
-      <w:r>
-        <w:rPr>
-          <w:rStyle w:val="NormalTok"/>
-        </w:rPr>
-        <w:t>(</w:t>
-      </w:r>
-      <w:r>
-        <w:rPr>
-          <w:rStyle w:val="DecValTok"/>
-        </w:rPr>
-        <w:t>85</w:t>
-      </w:r>
-      <w:r>
-        <w:rPr>
-          <w:rStyle w:val="NormalTok"/>
-        </w:rPr>
-        <w:t>,</w:t>
-      </w:r>
-      <w:r>
-        <w:rPr>
-          <w:rStyle w:val="DecValTok"/>
-        </w:rPr>
-        <w:t>95</w:t>
-      </w:r>
-      <w:r>
-        <w:rPr>
-          <w:rStyle w:val="NormalTok"/>
-        </w:rPr>
-        <w:t>))</w:t>
-      </w:r>
-      <w:r>
-        <w:br/>
-      </w:r>
-      <w:r>
-        <w:rPr>
-          <w:rStyle w:val="FunctionTok"/>
-        </w:rPr>
-        <w:t>autoplot</w:t>
-      </w:r>
-      <w:r>
-        <w:rPr>
-          <w:rStyle w:val="NormalTok"/>
-        </w:rPr>
-        <w:t>(forecast_lake,</w:t>
-      </w:r>
-      <w:r>
-        <w:rPr>
-          <w:rStyle w:val="AttributeTok"/>
-        </w:rPr>
         <w:t>main=</w:t>
       </w:r>
       <w:r>
         <w:rPr>
           <w:rStyle w:val="StringTok"/>
         </w:rPr>
-        <w:t>'arima(0,1,0)forecast'</w:t>
+        <w:t>'arima(1,1,2)forecast'</w:t>
       </w:r>
       <w:r>
         <w:rPr>
@@ -2789,6 +3818,7 @@
           <w:noProof/>
           <w:lang w:val="en-IN" w:eastAsia="en-IN"/>
         </w:rPr>
+        <w:lastRenderedPageBreak/>
         <w:drawing>
           <wp:inline distT="0" distB="0" distL="0" distR="0">
             <wp:extent cx="4620126" cy="3696101"/>
@@ -2799,7 +3829,7 @@
               <a:graphicData uri="http://schemas.openxmlformats.org/drawingml/2006/picture">
                 <pic:pic xmlns:pic="http://schemas.openxmlformats.org/drawingml/2006/picture">
                   <pic:nvPicPr>
-                    <pic:cNvPr id="40" name="Picture" descr="lakehuron_files/figure-docx/unnamed-chunk-1-7.png"/>
+                    <pic:cNvPr id="40" name="Picture" descr="LAKEHURON_files/figure-docx/unnamed-chunk-1-7.png"/>
                     <pic:cNvPicPr>
                       <a:picLocks noChangeAspect="1" noChangeArrowheads="1"/>
                     </pic:cNvPicPr>
@@ -2840,8 +3870,7 @@
         <w:rPr>
           <w:rStyle w:val="NormalTok"/>
         </w:rPr>
-        <w:lastRenderedPageBreak/>
-        <w:t xml:space="preserve"> plot</w:t>
+        <w:t>plot</w:t>
       </w:r>
     </w:p>
     <w:p>
@@ -2870,22 +3899,16 @@
         <w:rPr>
           <w:rStyle w:val="VerbatimChar"/>
         </w:rPr>
-        <w:t>## &lt;bytecode: 0x000001cfbbf62cc8&gt;</w:t>
-      </w:r>
-      <w:r>
-        <w:br/>
-      </w:r>
-      <w:r>
-        <w:rPr>
-          <w:rStyle w:val="VerbatimChar"/>
-        </w:rPr>
-        <w:t>## &lt;environment: namespace:bas</w:t>
-      </w:r>
-      <w:r>
-        <w:rPr>
-          <w:rStyle w:val="VerbatimChar"/>
-        </w:rPr>
-        <w:t>e&gt;</w:t>
+        <w:t>## &lt;bytecode: 0x000002488ec88a58&gt;</w:t>
+      </w:r>
+      <w:r>
+        <w:br/>
+      </w:r>
+      <w:r>
+        <w:rPr>
+          <w:rStyle w:val="VerbatimChar"/>
+        </w:rPr>
+        <w:t>## &lt;environment: namespace:base&gt;</w:t>
       </w:r>
     </w:p>
     <w:p>
@@ -2932,7 +3955,7 @@
         <w:rPr>
           <w:rStyle w:val="StringTok"/>
         </w:rPr>
-        <w:t>'forecast vs test data in arima(0,1,0)'</w:t>
+        <w:t>'forecast vs test data in arima(1,1,2)'</w:t>
       </w:r>
       <w:r>
         <w:rPr>
@@ -3004,7 +4027,7 @@
         <w:rPr>
           <w:rStyle w:val="StringTok"/>
         </w:rPr>
-        <w:t>'topright'</w:t>
+        <w:t>'bottomright'</w:t>
       </w:r>
       <w:r>
         <w:rPr>
@@ -3112,6 +4135,7 @@
           <w:noProof/>
           <w:lang w:val="en-IN" w:eastAsia="en-IN"/>
         </w:rPr>
+        <w:lastRenderedPageBreak/>
         <w:drawing>
           <wp:inline distT="0" distB="0" distL="0" distR="0">
             <wp:extent cx="4620126" cy="3696101"/>
@@ -3122,7 +4146,7 @@
               <a:graphicData uri="http://schemas.openxmlformats.org/drawingml/2006/picture">
                 <pic:pic xmlns:pic="http://schemas.openxmlformats.org/drawingml/2006/picture">
                   <pic:nvPicPr>
-                    <pic:cNvPr id="43" name="Picture" descr="lakehuron_files/figure-docx/unnamed-chunk-1-8.png"/>
+                    <pic:cNvPr id="43" name="Picture" descr="LAKEHURON_files/figure-docx/unnamed-chunk-1-8.png"/>
                     <pic:cNvPicPr>
                       <a:picLocks noChangeAspect="1" noChangeArrowheads="1"/>
                     </pic:cNvPicPr>
@@ -3155,491 +4179,6 @@
         </w:drawing>
       </w:r>
     </w:p>
-    <w:p>
-      <w:pPr>
-        <w:pStyle w:val="SourceCode"/>
-      </w:pPr>
-      <w:r>
-        <w:rPr>
-          <w:rStyle w:val="CommentTok"/>
-        </w:rPr>
-        <w:t>#model comaparison</w:t>
-      </w:r>
-      <w:r>
-        <w:br/>
-      </w:r>
-      <w:r>
-        <w:rPr>
-          <w:rStyle w:val="NormalTok"/>
-        </w:rPr>
-        <w:t>accuracy</w:t>
-      </w:r>
-      <w:r>
-        <w:rPr>
-          <w:rStyle w:val="OtherTok"/>
-        </w:rPr>
-        <w:t>=</w:t>
-      </w:r>
-      <w:r>
-        <w:rPr>
-          <w:rStyle w:val="NormalTok"/>
-        </w:rPr>
-        <w:t>forecast_lake</w:t>
-      </w:r>
-      <w:r>
-        <w:rPr>
-          <w:rStyle w:val="SpecialCharTok"/>
-        </w:rPr>
-        <w:t>$</w:t>
-      </w:r>
-      <w:r>
-        <w:rPr>
-          <w:rStyle w:val="NormalTok"/>
-        </w:rPr>
-        <w:t>mean</w:t>
-      </w:r>
-      <w:r>
-        <w:rPr>
-          <w:rStyle w:val="SpecialCharTok"/>
-        </w:rPr>
-        <w:t>-</w:t>
-      </w:r>
-      <w:r>
-        <w:rPr>
-          <w:rStyle w:val="NormalTok"/>
-        </w:rPr>
-        <w:t>lake_test</w:t>
-      </w:r>
-      <w:r>
-        <w:br/>
-      </w:r>
-      <w:r>
-        <w:rPr>
-          <w:rStyle w:val="FunctionTok"/>
-        </w:rPr>
-        <w:t>cat</w:t>
-      </w:r>
-      <w:r>
-        <w:rPr>
-          <w:rStyle w:val="NormalTok"/>
-        </w:rPr>
-        <w:t>(</w:t>
-      </w:r>
-      <w:r>
-        <w:rPr>
-          <w:rStyle w:val="StringTok"/>
-        </w:rPr>
-        <w:t>"test error n 22 data points"</w:t>
-      </w:r>
-      <w:r>
-        <w:rPr>
-          <w:rStyle w:val="NormalTok"/>
-        </w:rPr>
-        <w:t>,</w:t>
-      </w:r>
-      <w:r>
-        <w:rPr>
-          <w:rStyle w:val="FunctionTok"/>
-        </w:rPr>
-        <w:t>sum</w:t>
-      </w:r>
-      <w:r>
-        <w:rPr>
-          <w:rStyle w:val="NormalTok"/>
-        </w:rPr>
-        <w:t>(accuracy</w:t>
-      </w:r>
-      <w:r>
-        <w:rPr>
-          <w:rStyle w:val="SpecialCharTok"/>
-        </w:rPr>
-        <w:t>^</w:t>
-      </w:r>
-      <w:r>
-        <w:rPr>
-          <w:rStyle w:val="DecValTok"/>
-        </w:rPr>
-        <w:t>2</w:t>
-      </w:r>
-      <w:r>
-        <w:rPr>
-          <w:rStyle w:val="NormalTok"/>
-        </w:rPr>
-        <w:t>),</w:t>
-      </w:r>
-      <w:r>
-        <w:rPr>
-          <w:rStyle w:val="StringTok"/>
-        </w:rPr>
-        <w:t>'</w:t>
-      </w:r>
-      <w:r>
-        <w:rPr>
-          <w:rStyle w:val="SpecialCharTok"/>
-        </w:rPr>
-        <w:t>\n</w:t>
-      </w:r>
-      <w:r>
-        <w:rPr>
-          <w:rStyle w:val="StringTok"/>
-        </w:rPr>
-        <w:t>'</w:t>
-      </w:r>
-      <w:r>
-        <w:rPr>
-          <w:rStyle w:val="NormalTok"/>
-        </w:rPr>
-        <w:t>)</w:t>
-      </w:r>
-    </w:p>
-    <w:p>
-      <w:pPr>
-        <w:pStyle w:val="SourceCode"/>
-      </w:pPr>
-      <w:r>
-        <w:rPr>
-          <w:rStyle w:val="VerbatimChar"/>
-        </w:rPr>
-        <w:t>## test error n 22 data points 43.1035</w:t>
-      </w:r>
-    </w:p>
-    <w:p>
-      <w:pPr>
-        <w:pStyle w:val="SourceCode"/>
-      </w:pPr>
-      <w:r>
-        <w:rPr>
-          <w:rStyle w:val="FunctionTok"/>
-        </w:rPr>
-        <w:t>cat</w:t>
-      </w:r>
-      <w:r>
-        <w:rPr>
-          <w:rStyle w:val="NormalTok"/>
-        </w:rPr>
-        <w:t>(</w:t>
-      </w:r>
-      <w:r>
-        <w:rPr>
-          <w:rStyle w:val="StringTok"/>
-        </w:rPr>
-        <w:t>'train_error'</w:t>
-      </w:r>
-      <w:r>
-        <w:rPr>
-          <w:rStyle w:val="NormalTok"/>
-        </w:rPr>
-        <w:t>,manual_3</w:t>
-      </w:r>
-      <w:r>
-        <w:rPr>
-          <w:rStyle w:val="SpecialCharTok"/>
-        </w:rPr>
-        <w:t>$</w:t>
-      </w:r>
-      <w:r>
-        <w:rPr>
-          <w:rStyle w:val="NormalTok"/>
-        </w:rPr>
-        <w:t>sigma2)</w:t>
-      </w:r>
-    </w:p>
-    <w:p>
-      <w:pPr>
-        <w:pStyle w:val="SourceCode"/>
-      </w:pPr>
-      <w:r>
-        <w:rPr>
-          <w:rStyle w:val="VerbatimChar"/>
-        </w:rPr>
-        <w:t>## train_error 0.491264</w:t>
-      </w:r>
-    </w:p>
-    <w:p>
-      <w:pPr>
-        <w:pStyle w:val="SourceCode"/>
-      </w:pPr>
-      <w:r>
-        <w:rPr>
-          <w:rStyle w:val="NormalTok"/>
-        </w:rPr>
-        <w:t>forecast_lake_1</w:t>
-      </w:r>
-      <w:r>
-        <w:rPr>
-          <w:rStyle w:val="OtherTok"/>
-        </w:rPr>
-        <w:t>=</w:t>
-      </w:r>
-      <w:r>
-        <w:rPr>
-          <w:rStyle w:val="FunctionTok"/>
-        </w:rPr>
-        <w:t>forecast</w:t>
-      </w:r>
-      <w:r>
-        <w:rPr>
-          <w:rStyle w:val="NormalTok"/>
-        </w:rPr>
-        <w:t>(manual,</w:t>
-      </w:r>
-      <w:r>
-        <w:rPr>
-          <w:rStyle w:val="AttributeTok"/>
-        </w:rPr>
-        <w:t>h=</w:t>
-      </w:r>
-      <w:r>
-        <w:rPr>
-          <w:rStyle w:val="DecValTok"/>
-        </w:rPr>
-        <w:t>22</w:t>
-      </w:r>
-      <w:r>
-        <w:rPr>
-          <w:rStyle w:val="NormalTok"/>
-        </w:rPr>
-        <w:t>,</w:t>
-      </w:r>
-      <w:r>
-        <w:rPr>
-          <w:rStyle w:val="AttributeTok"/>
-        </w:rPr>
-        <w:t>level=</w:t>
-      </w:r>
-      <w:r>
-        <w:rPr>
-          <w:rStyle w:val="FunctionTok"/>
-        </w:rPr>
-        <w:t>c</w:t>
-      </w:r>
-      <w:r>
-        <w:rPr>
-          <w:rStyle w:val="NormalTok"/>
-        </w:rPr>
-        <w:t>(</w:t>
-      </w:r>
-      <w:r>
-        <w:rPr>
-          <w:rStyle w:val="DecValTok"/>
-        </w:rPr>
-        <w:t>85</w:t>
-      </w:r>
-      <w:r>
-        <w:rPr>
-          <w:rStyle w:val="NormalTok"/>
-        </w:rPr>
-        <w:t>,</w:t>
-      </w:r>
-      <w:r>
-        <w:rPr>
-          <w:rStyle w:val="DecValTok"/>
-        </w:rPr>
-        <w:t>95</w:t>
-      </w:r>
-      <w:r>
-        <w:rPr>
-          <w:rStyle w:val="NormalTok"/>
-        </w:rPr>
-        <w:t>))</w:t>
-      </w:r>
-      <w:r>
-        <w:br/>
-      </w:r>
-      <w:r>
-        <w:rPr>
-          <w:rStyle w:val="NormalTok"/>
-        </w:rPr>
-        <w:t>accuracy_1</w:t>
-      </w:r>
-      <w:r>
-        <w:rPr>
-          <w:rStyle w:val="OtherTok"/>
-        </w:rPr>
-        <w:t>=</w:t>
-      </w:r>
-      <w:r>
-        <w:rPr>
-          <w:rStyle w:val="NormalTok"/>
-        </w:rPr>
-        <w:t>forecast_lake_1</w:t>
-      </w:r>
-      <w:r>
-        <w:rPr>
-          <w:rStyle w:val="SpecialCharTok"/>
-        </w:rPr>
-        <w:t>$</w:t>
-      </w:r>
-      <w:r>
-        <w:rPr>
-          <w:rStyle w:val="NormalTok"/>
-        </w:rPr>
-        <w:t>mean</w:t>
-      </w:r>
-      <w:r>
-        <w:rPr>
-          <w:rStyle w:val="SpecialCharTok"/>
-        </w:rPr>
-        <w:t>-</w:t>
-      </w:r>
-      <w:r>
-        <w:rPr>
-          <w:rStyle w:val="NormalTok"/>
-        </w:rPr>
-        <w:t>lake_test</w:t>
-      </w:r>
-      <w:r>
-        <w:br/>
-      </w:r>
-      <w:r>
-        <w:rPr>
-          <w:rStyle w:val="FunctionTok"/>
-        </w:rPr>
-        <w:t>cat</w:t>
-      </w:r>
-      <w:r>
-        <w:rPr>
-          <w:rStyle w:val="NormalTok"/>
-        </w:rPr>
-        <w:t>(</w:t>
-      </w:r>
-      <w:r>
-        <w:rPr>
-          <w:rStyle w:val="StringTok"/>
-        </w:rPr>
-        <w:t>"test e</w:t>
-      </w:r>
-      <w:r>
-        <w:rPr>
-          <w:rStyle w:val="StringTok"/>
-        </w:rPr>
-        <w:t>rror n 22 data points"</w:t>
-      </w:r>
-      <w:r>
-        <w:rPr>
-          <w:rStyle w:val="NormalTok"/>
-        </w:rPr>
-        <w:t>,</w:t>
-      </w:r>
-      <w:r>
-        <w:rPr>
-          <w:rStyle w:val="FunctionTok"/>
-        </w:rPr>
-        <w:t>sum</w:t>
-      </w:r>
-      <w:r>
-        <w:rPr>
-          <w:rStyle w:val="NormalTok"/>
-        </w:rPr>
-        <w:t>(accuracy_1</w:t>
-      </w:r>
-      <w:r>
-        <w:rPr>
-          <w:rStyle w:val="SpecialCharTok"/>
-        </w:rPr>
-        <w:t>^</w:t>
-      </w:r>
-      <w:r>
-        <w:rPr>
-          <w:rStyle w:val="DecValTok"/>
-        </w:rPr>
-        <w:t>2</w:t>
-      </w:r>
-      <w:r>
-        <w:rPr>
-          <w:rStyle w:val="NormalTok"/>
-        </w:rPr>
-        <w:t>),</w:t>
-      </w:r>
-      <w:r>
-        <w:rPr>
-          <w:rStyle w:val="StringTok"/>
-        </w:rPr>
-        <w:t>'</w:t>
-      </w:r>
-      <w:r>
-        <w:rPr>
-          <w:rStyle w:val="SpecialCharTok"/>
-        </w:rPr>
-        <w:t>\n</w:t>
-      </w:r>
-      <w:r>
-        <w:rPr>
-          <w:rStyle w:val="StringTok"/>
-        </w:rPr>
-        <w:t>'</w:t>
-      </w:r>
-      <w:r>
-        <w:rPr>
-          <w:rStyle w:val="NormalTok"/>
-        </w:rPr>
-        <w:t>)</w:t>
-      </w:r>
-    </w:p>
-    <w:p>
-      <w:pPr>
-        <w:pStyle w:val="SourceCode"/>
-      </w:pPr>
-      <w:r>
-        <w:rPr>
-          <w:rStyle w:val="VerbatimChar"/>
-        </w:rPr>
-        <w:t>## test error n 22 data points 38.78347</w:t>
-      </w:r>
-    </w:p>
-    <w:p>
-      <w:pPr>
-        <w:pStyle w:val="SourceCode"/>
-      </w:pPr>
-      <w:r>
-        <w:rPr>
-          <w:rStyle w:val="FunctionTok"/>
-        </w:rPr>
-        <w:t>cat</w:t>
-      </w:r>
-      <w:r>
-        <w:rPr>
-          <w:rStyle w:val="NormalTok"/>
-        </w:rPr>
-        <w:t>(</w:t>
-      </w:r>
-      <w:r>
-        <w:rPr>
-          <w:rStyle w:val="StringTok"/>
-        </w:rPr>
-        <w:t>'train_error'</w:t>
-      </w:r>
-      <w:r>
-        <w:rPr>
-          <w:rStyle w:val="NormalTok"/>
-        </w:rPr>
-        <w:t>,manual</w:t>
-      </w:r>
-      <w:r>
-        <w:rPr>
-          <w:rStyle w:val="SpecialCharTok"/>
-        </w:rPr>
-        <w:t>$</w:t>
-      </w:r>
-      <w:r>
-        <w:rPr>
-          <w:rStyle w:val="NormalTok"/>
-        </w:rPr>
-        <w:t>sigma2)</w:t>
-      </w:r>
-    </w:p>
-    <w:p>
-      <w:pPr>
-        <w:pStyle w:val="SourceCode"/>
-      </w:pPr>
-      <w:r>
-        <w:rPr>
-          <w:rStyle w:val="VerbatimChar"/>
-        </w:rPr>
-        <w:lastRenderedPageBreak/>
-        <w:t>## train_error 0.4258698</w:t>
-      </w:r>
-    </w:p>
     <w:sectPr>
       <w:pgSz w:w="12240" w:h="15840"/>
       <w:pgMar w:top="1440" w:right="1440" w:bottom="1440" w:left="1440" w:header="720" w:footer="720" w:gutter="0"/>
@@ -3654,7 +4193,7 @@
   <w:abstractNum w:abstractNumId="0" w15:restartNumberingAfterBreak="0">
     <w:nsid w:val="0000A990"/>
     <w:multiLevelType w:val="multilevel"/>
-    <w:tmpl w:val="7D5A6E80"/>
+    <w:tmpl w:val="2CE0FF94"/>
     <w:lvl w:ilvl="0">
       <w:numFmt w:val="bullet"/>
       <w:lvlText w:val=" "/>

</xml_diff>